<commit_message>
Week 7 WorkLog Upload
Worklog Update.
</commit_message>
<xml_diff>
--- a/Work/2021180023_LKA/WorkLog/이규아_작업일지_7주차.docx
+++ b/Work/2021180023_LKA/WorkLog/이규아_작업일지_7주차.docx
@@ -55,7 +55,7 @@
               <w:rPr>
                 <w:rFonts w:hint="eastAsia"/>
               </w:rPr>
-              <w:t>6</w:t>
+              <w:t>7</w:t>
             </w:r>
             <w:r>
               <w:rPr>
@@ -223,6 +223,34 @@
               </w:rPr>
               <w:t xml:space="preserve">1. </w:t>
             </w:r>
+            <w:r>
+              <w:rPr>
+                <w:rFonts w:hint="eastAsia"/>
+              </w:rPr>
+              <w:t>멀티플레이 안정화 작업</w:t>
+            </w:r>
+          </w:p>
+          <w:p>
+            <w:pPr>
+              <w:tabs>
+                <w:tab w:val="left" w:pos="2765"/>
+              </w:tabs>
+              <w:rPr>
+                <w:rFonts w:hint="eastAsia"/>
+              </w:rPr>
+            </w:pPr>
+            <w:r>
+              <w:rPr>
+                <w:rFonts w:hint="eastAsia"/>
+              </w:rPr>
+              <w:t xml:space="preserve">2. </w:t>
+            </w:r>
+            <w:r>
+              <w:rPr>
+                <w:rFonts w:hint="eastAsia"/>
+              </w:rPr>
+              <w:t>VFX 연출 강화</w:t>
+            </w:r>
           </w:p>
           <w:p>
             <w:pPr>
@@ -234,23 +262,13 @@
               <w:rPr>
                 <w:rFonts w:hint="eastAsia"/>
               </w:rPr>
-              <w:t xml:space="preserve">2. </w:t>
-            </w:r>
-          </w:p>
-          <w:p>
-            <w:pPr>
-              <w:tabs>
-                <w:tab w:val="left" w:pos="2765"/>
-              </w:tabs>
-              <w:rPr>
-                <w:rFonts w:hint="eastAsia"/>
-              </w:rPr>
-            </w:pPr>
-            <w:r>
-              <w:rPr>
-                <w:rFonts w:hint="eastAsia"/>
-              </w:rPr>
               <w:t xml:space="preserve">3. </w:t>
+            </w:r>
+            <w:r>
+              <w:rPr>
+                <w:rFonts w:hint="eastAsia"/>
+              </w:rPr>
+              <w:t>졸작 회의</w:t>
             </w:r>
           </w:p>
         </w:tc>
@@ -270,7 +288,7 @@
     <w:p>
       <w:pPr>
         <w:tabs>
-          <w:tab w:val="left" w:pos="2765"/>
+          <w:tab w:val="left" w:pos="3450"/>
         </w:tabs>
       </w:pPr>
       <w:r>
@@ -279,6 +297,54 @@
         </w:rPr>
         <w:t xml:space="preserve">1. </w:t>
       </w:r>
+      <w:r>
+        <w:rPr>
+          <w:rFonts w:hint="eastAsia"/>
+        </w:rPr>
+        <w:t>멀티플레이 안정화 작업</w:t>
+      </w:r>
+    </w:p>
+    <w:p>
+      <w:pPr>
+        <w:tabs>
+          <w:tab w:val="left" w:pos="3450"/>
+        </w:tabs>
+      </w:pPr>
+      <w:r>
+        <w:rPr>
+          <w:rFonts w:hint="eastAsia"/>
+        </w:rPr>
+        <w:t>멀티플레이 접속 관련하여 안정화 작업 실시</w:t>
+      </w:r>
+    </w:p>
+    <w:p>
+      <w:pPr>
+        <w:tabs>
+          <w:tab w:val="left" w:pos="3450"/>
+        </w:tabs>
+      </w:pPr>
+      <w:r>
+        <w:rPr>
+          <w:rFonts w:hint="eastAsia"/>
+        </w:rPr>
+        <w:t>기존에 로그인 상태에서 서버가 내려갈 경우 자동 로그아웃이 안 되거나 재접속이 안되는 문제 해결</w:t>
+      </w:r>
+    </w:p>
+    <w:p>
+      <w:pPr>
+        <w:tabs>
+          <w:tab w:val="left" w:pos="3450"/>
+        </w:tabs>
+        <w:rPr>
+          <w:rFonts w:hint="eastAsia"/>
+        </w:rPr>
+      </w:pPr>
+      <w:r>
+        <w:rPr>
+          <w:rFonts w:hint="eastAsia"/>
+        </w:rPr>
+        <w:t>안전하게 로그인 토큰을 제거하고 로그아웃 상태로 변경하게 설정</w:t>
+      </w:r>
     </w:p>
     <w:p>
       <w:pPr>
@@ -292,6 +358,31 @@
         </w:rPr>
         <w:t xml:space="preserve">2. </w:t>
       </w:r>
+      <w:r>
+        <w:rPr>
+          <w:rFonts w:hint="eastAsia"/>
+        </w:rPr>
+        <w:t>VFX 연출 강화</w:t>
+      </w:r>
+    </w:p>
+    <w:p>
+      <w:pPr>
+        <w:tabs>
+          <w:tab w:val="left" w:pos="2765"/>
+        </w:tabs>
+      </w:pPr>
+      <w:r>
+        <w:rPr>
+          <w:rFonts w:hint="eastAsia"/>
+        </w:rPr>
+        <w:t xml:space="preserve">기존 일렁이는 연출에서 가우시안 블러와 </w:t>
+      </w:r>
+      <w:r>
+        <w:rPr>
+          <w:rFonts w:hint="eastAsia"/>
+        </w:rPr>
+        <w:t>어지러움증 효과를 대폭 강화</w:t>
+      </w:r>
     </w:p>
     <w:p>
       <w:pPr>
@@ -306,7 +397,58 @@
         <w:rPr>
           <w:rFonts w:hint="eastAsia"/>
         </w:rPr>
+        <w:t>단순히 규칙적인 일렁임 연출에서 불규칙적이고 시야가 흐려지는 연출을 보여줌</w:t>
+      </w:r>
+    </w:p>
+    <w:p>
+      <w:pPr>
+        <w:tabs>
+          <w:tab w:val="left" w:pos="2765"/>
+        </w:tabs>
+      </w:pPr>
+      <w:r>
+        <w:rPr>
+          <w:rFonts w:hint="eastAsia"/>
+        </w:rPr>
         <w:t xml:space="preserve">3. </w:t>
+      </w:r>
+      <w:r>
+        <w:rPr>
+          <w:rFonts w:hint="eastAsia"/>
+        </w:rPr>
+        <w:t>졸작 회의</w:t>
+      </w:r>
+    </w:p>
+    <w:p>
+      <w:pPr>
+        <w:tabs>
+          <w:tab w:val="left" w:pos="2765"/>
+        </w:tabs>
+        <w:rPr>
+          <w:rFonts w:hint="eastAsia"/>
+        </w:rPr>
+      </w:pPr>
+      <w:r>
+        <w:rPr>
+          <w:rFonts w:hint="eastAsia"/>
+        </w:rPr>
+        <w:t>콘텐츠 관련 내용 회의</w:t>
+      </w:r>
+    </w:p>
+    <w:p>
+      <w:pPr>
+        <w:tabs>
+          <w:tab w:val="left" w:pos="2765"/>
+        </w:tabs>
+        <w:rPr>
+          <w:rFonts w:hint="eastAsia"/>
+        </w:rPr>
+      </w:pPr>
+      <w:r>
+        <w:rPr>
+          <w:rFonts w:hint="eastAsia"/>
+        </w:rPr>
+        <w:t>앞으로 개발할 내용 회의</w:t>
       </w:r>
     </w:p>
     <w:tbl>
@@ -448,11 +590,6 @@
             <w:tcW w:w="2254" w:type="dxa"/>
           </w:tcPr>
           <w:p>
-            <w:pPr>
-              <w:rPr>
-                <w:rFonts w:hint="eastAsia"/>
-              </w:rPr>
-            </w:pPr>
             <w:r>
               <w:rPr>
                 <w:rFonts w:hint="eastAsia"/>
@@ -553,18 +690,8 @@
                 <w:b/>
                 <w:bCs/>
               </w:rPr>
-              <w:t xml:space="preserve">다음주 </w:t>
-            </w:r>
-            <w:proofErr w:type="spellStart"/>
-            <w:r>
-              <w:rPr>
-                <w:rFonts w:hint="eastAsia"/>
-                <w:b/>
-                <w:bCs/>
-              </w:rPr>
-              <w:t>할일</w:t>
-            </w:r>
-            <w:proofErr w:type="spellEnd"/>
+              <w:t>다음주 할일</w:t>
+            </w:r>
           </w:p>
         </w:tc>
         <w:tc>
@@ -584,6 +711,12 @@
               </w:rPr>
               <w:t xml:space="preserve">1. </w:t>
             </w:r>
+            <w:r>
+              <w:rPr>
+                <w:rFonts w:hint="eastAsia"/>
+              </w:rPr>
+              <w:t>멀티플레이 마네킹 로직 변경</w:t>
+            </w:r>
           </w:p>
           <w:p>
             <w:pPr>
@@ -597,21 +730,30 @@
               </w:rPr>
               <w:t xml:space="preserve">2. </w:t>
             </w:r>
+            <w:r>
+              <w:rPr>
+                <w:rFonts w:hint="eastAsia"/>
+              </w:rPr>
+              <w:t>마네킹 플레이어 조작키 추가</w:t>
+            </w:r>
           </w:p>
           <w:p>
             <w:pPr>
               <w:tabs>
                 <w:tab w:val="left" w:pos="2765"/>
               </w:tabs>
-              <w:rPr>
-                <w:rFonts w:hint="eastAsia"/>
-              </w:rPr>
             </w:pPr>
             <w:r>
               <w:rPr>
                 <w:rFonts w:hint="eastAsia"/>
               </w:rPr>
               <w:t xml:space="preserve">3. </w:t>
+            </w:r>
+            <w:r>
+              <w:rPr>
+                <w:rFonts w:hint="eastAsia"/>
+              </w:rPr>
+              <w:t>졸작 회의</w:t>
             </w:r>
           </w:p>
         </w:tc>
@@ -675,7 +817,7 @@
     </w:tbl>
     <w:p/>
     <w:sectPr>
-      <w:headerReference w:type="default" r:id="rId7"/>
+      <w:headerReference w:type="default" r:id="rId8"/>
       <w:pgSz w:w="11906" w:h="16838"/>
       <w:pgMar w:top="1701" w:right="1440" w:bottom="1440" w:left="1440" w:header="851" w:footer="992" w:gutter="0"/>
       <w:cols w:space="720"/>
@@ -787,23 +929,13 @@
         <w:bCs/>
       </w:rPr>
     </w:pPr>
-    <w:proofErr w:type="spellStart"/>
     <w:r>
       <w:rPr>
         <w:rFonts w:hint="eastAsia"/>
         <w:b/>
         <w:bCs/>
       </w:rPr>
-      <w:t>팀명</w:t>
-    </w:r>
-    <w:proofErr w:type="spellEnd"/>
-    <w:r>
-      <w:rPr>
-        <w:rFonts w:hint="eastAsia"/>
-        <w:b/>
-        <w:bCs/>
-      </w:rPr>
-      <w:t>:</w:t>
+      <w:t>팀명:</w:t>
     </w:r>
     <w:r>
       <w:rPr>
@@ -2698,4 +2830,16 @@
   <a:objectDefaults/>
   <a:extraClrSchemeLst/>
 </a:theme>
+</file>
+
+<file path=customXml/item1.xml><?xml version="1.0" encoding="utf-8"?>
+<b:Sources xmlns:b="http://schemas.openxmlformats.org/officeDocument/2006/bibliography" xmlns="http://schemas.openxmlformats.org/officeDocument/2006/bibliography" SelectedStyle="\APASixthEditionOfficeOnline.xsl" StyleName="APA" Version="6"/>
+</file>
+
+<file path=customXml/itemProps1.xml><?xml version="1.0" encoding="utf-8"?>
+<ds:datastoreItem xmlns:ds="http://schemas.openxmlformats.org/officeDocument/2006/customXml" ds:itemID="{87DA43F3-3D85-4E87-B2B4-43750526BD85}">
+  <ds:schemaRefs>
+    <ds:schemaRef ds:uri="http://schemas.openxmlformats.org/officeDocument/2006/bibliography"/>
+  </ds:schemaRefs>
+</ds:datastoreItem>
 </file>
</xml_diff>